<commit_message>
Auto sync 20251103 181600
</commit_message>
<xml_diff>
--- a/Безопасность информационных систем и технологий/Лабораторные/Отчет по лабораторной 5.docx
+++ b/Безопасность информационных систем и технологий/Лабораторные/Отчет по лабораторной 5.docx
@@ -598,30 +598,8 @@
         <w:ind w:firstLine="709"/>
         <w:jc w:val="both"/>
       </w:pPr>
-      <w:r>
-        <w:t xml:space="preserve">Для выполнения задания </w:t>
-      </w:r>
-      <w:r>
-        <w:t xml:space="preserve">было принято решение реализовать алгоритм </w:t>
-      </w:r>
-      <w:proofErr w:type="spellStart"/>
-      <w:r>
-        <w:t>Виженера</w:t>
-      </w:r>
-      <w:proofErr w:type="spellEnd"/>
-      <w:r>
-        <w:t xml:space="preserve"> и возможностью его взлома</w:t>
-      </w:r>
-    </w:p>
-    <w:p>
-      <w:pPr>
-        <w:tabs>
-          <w:tab w:val="left" w:pos="993"/>
-        </w:tabs>
-        <w:spacing w:line="360" w:lineRule="auto"/>
-        <w:ind w:firstLine="709"/>
-        <w:jc w:val="both"/>
-      </w:pPr>
+      <w:bookmarkStart w:id="0" w:name="_GoBack"/>
+      <w:bookmarkEnd w:id="0"/>
     </w:p>
     <w:p>
       <w:pPr>
@@ -1782,19 +1760,11 @@
           <w:lang w:val="ru-RU"/>
         </w:rPr>
       </w:pPr>
-      <w:proofErr w:type="gramStart"/>
-      <w:r>
-        <w:rPr>
-          <w:lang w:val="ru-RU"/>
-        </w:rPr>
-        <w:t>Принцип работы метода</w:t>
-      </w:r>
-      <w:proofErr w:type="gramEnd"/>
-      <w:r>
-        <w:rPr>
-          <w:lang w:val="ru-RU"/>
-        </w:rPr>
-        <w:t xml:space="preserve"> следующий:</w:t>
+      <w:r>
+        <w:rPr>
+          <w:lang w:val="ru-RU"/>
+        </w:rPr>
+        <w:t>Принцип работы метода следующий:</w:t>
       </w:r>
     </w:p>
     <w:p>
@@ -2114,8 +2084,6 @@
         </w:rPr>
         <w:t>Кроме того, при использовании коротких контрольных сумм вероятность случайных совпадений достаточно велика, что ограничивает степень доверия к целостности данных, проверяемых только этим методом.</w:t>
       </w:r>
-      <w:bookmarkStart w:id="0" w:name="_GoBack"/>
-      <w:bookmarkEnd w:id="0"/>
     </w:p>
     <w:p>
       <w:pPr>

</xml_diff>